<commit_message>
BD: Creación de las tablas para la BD
</commit_message>
<xml_diff>
--- a/A-Documentacion/A-Inicio/Iteracion1-31_8-al-20_9/2-EspecificacionRequerimientos/eGradudos_Inicio_Iteracion1_RequerimientosPreliminares.docx
+++ b/A-Documentacion/A-Inicio/Iteracion1-31_8-al-20_9/2-EspecificacionRequerimientos/eGradudos_Inicio_Iteracion1_RequerimientosPreliminares.docx
@@ -129,7 +129,7 @@
                   <w:sz w:val="72"/>
                   <w:szCs w:val="72"/>
                 </w:rPr>
-                <w:t xml:space="preserve">Especificación de requerimientos </w:t>
+                <w:t>Especificación de requerimientos</w:t>
               </w:r>
             </w:p>
           </w:sdtContent>
@@ -2419,7 +2419,7 @@
             <w:pStyle w:val="PSI-Ttulo"/>
           </w:pPr>
           <w:r>
-            <w:t xml:space="preserve">Especificación de requerimientos </w:t>
+            <w:t>Especificación de requerimientos</w:t>
           </w:r>
         </w:p>
       </w:sdtContent>
@@ -6642,7 +6642,10 @@
               <w:pStyle w:val="PSI-Normal"/>
             </w:pPr>
             <w:r>
-              <w:t>El usuario ingresa al sistema</w:t>
+              <w:t xml:space="preserve">El usuario ingresa al </w:t>
+            </w:r>
+            <w:r>
+              <w:t>panel de títulos</w:t>
             </w:r>
           </w:p>
         </w:tc>
@@ -14509,7 +14512,7 @@
           <w:rPr>
             <w:rFonts w:asciiTheme="majorHAnsi" w:eastAsiaTheme="majorEastAsia" w:hAnsiTheme="majorHAnsi" w:cstheme="majorBidi"/>
           </w:rPr>
-          <w:t xml:space="preserve">Especificación de requerimientos </w:t>
+          <w:t>Especificación de requerimientos</w:t>
         </w:r>
       </w:p>
     </w:sdtContent>

</xml_diff>